<commit_message>
Update workshop slides and instructions
</commit_message>
<xml_diff>
--- a/Workshop-Instructions.docx
+++ b/Workshop-Instructions.docx
@@ -207,65 +207,18 @@
         </w:rPr>
         <w:t xml:space="preserve"> </w:t>
       </w:r>
-      <w:r>
-        <w:rPr>
-          <w:rFonts w:ascii="Times New Roman" w:hAnsi="Times New Roman" w:cs="Times New Roman"/>
-          <w:i/>
-          <w:iCs/>
-          <w:sz w:val="22"/>
-          <w:szCs w:val="22"/>
-        </w:rPr>
-        <w:fldChar w:fldCharType="begin"/>
-      </w:r>
-      <w:r>
-        <w:rPr>
-          <w:rFonts w:ascii="Times New Roman" w:hAnsi="Times New Roman" w:cs="Times New Roman"/>
-          <w:i/>
-          <w:iCs/>
-          <w:sz w:val="22"/>
-          <w:szCs w:val="22"/>
-        </w:rPr>
-        <w:instrText>HYPERLINK "https://harvard.zoom.us/j/2304706732?omn=92517624341" \t "_new"</w:instrText>
-      </w:r>
-      <w:r>
-        <w:rPr>
-          <w:rFonts w:ascii="Times New Roman" w:hAnsi="Times New Roman" w:cs="Times New Roman"/>
-          <w:i/>
-          <w:iCs/>
-          <w:sz w:val="22"/>
-          <w:szCs w:val="22"/>
-        </w:rPr>
-      </w:r>
-      <w:r>
-        <w:rPr>
-          <w:rFonts w:ascii="Times New Roman" w:hAnsi="Times New Roman" w:cs="Times New Roman"/>
-          <w:i/>
-          <w:iCs/>
-          <w:sz w:val="22"/>
-          <w:szCs w:val="22"/>
-        </w:rPr>
-        <w:fldChar w:fldCharType="separate"/>
-      </w:r>
-      <w:r>
-        <w:rPr>
-          <w:rFonts w:ascii="Times New Roman" w:hAnsi="Times New Roman" w:cs="Times New Roman"/>
-          <w:i/>
-          <w:iCs/>
-          <w:sz w:val="22"/>
-          <w:szCs w:val="22"/>
-        </w:rPr>
-        <w:t>https://harvard.zoom.us/j/2304706732?omn=92517624341</w:t>
-      </w:r>
-      <w:r>
-        <w:rPr>
-          <w:rFonts w:ascii="Times New Roman" w:hAnsi="Times New Roman" w:cs="Times New Roman"/>
-          <w:i/>
-          <w:iCs/>
-          <w:sz w:val="22"/>
-          <w:szCs w:val="22"/>
-        </w:rPr>
-        <w:fldChar w:fldCharType="end"/>
-      </w:r>
+      <w:hyperlink r:id="rId6" w:tgtFrame="_new" w:history="1">
+        <w:r>
+          <w:rPr>
+            <w:rFonts w:ascii="Times New Roman" w:hAnsi="Times New Roman" w:cs="Times New Roman"/>
+            <w:i/>
+            <w:iCs/>
+            <w:sz w:val="22"/>
+            <w:szCs w:val="22"/>
+          </w:rPr>
+          <w:t>https://harvard.zoom.us/j/2304706732?omn=92517624341</w:t>
+        </w:r>
+      </w:hyperlink>
     </w:p>
     <w:p>
       <w:pPr>
@@ -339,7 +292,7 @@
         </w:rPr>
         <w:t xml:space="preserve">. (1) Go to: </w:t>
       </w:r>
-      <w:hyperlink r:id="rId6" w:history="1">
+      <w:hyperlink r:id="rId7" w:history="1">
         <w:r>
           <w:rPr>
             <w:rStyle w:val="Hyperlink"/>
@@ -354,6 +307,41 @@
         </w:rPr>
         <w:t xml:space="preserve"> (2) Click Download ZIP as shown below.</w:t>
       </w:r>
+      <w:r>
+        <w:rPr>
+          <w:rFonts w:ascii="Times New Roman" w:hAnsi="Times New Roman" w:cs="Times New Roman"/>
+        </w:rPr>
+        <w:t xml:space="preserve"> If you do not have a </w:t>
+      </w:r>
+      <w:proofErr w:type="spellStart"/>
+      <w:r>
+        <w:rPr>
+          <w:rFonts w:ascii="Times New Roman" w:hAnsi="Times New Roman" w:cs="Times New Roman"/>
+        </w:rPr>
+        <w:t>github</w:t>
+      </w:r>
+      <w:proofErr w:type="spellEnd"/>
+      <w:r>
+        <w:rPr>
+          <w:rFonts w:ascii="Times New Roman" w:hAnsi="Times New Roman" w:cs="Times New Roman"/>
+        </w:rPr>
+        <w:t xml:space="preserve"> account, download from: </w:t>
+      </w:r>
+      <w:hyperlink r:id="rId8" w:history="1">
+        <w:r>
+          <w:rPr>
+            <w:rStyle w:val="Hyperlink"/>
+            <w:rFonts w:ascii="Times New Roman" w:hAnsi="Times New Roman" w:cs="Times New Roman"/>
+          </w:rPr>
+          <w:t>https://drive.google.com/drive/folders/1wjZ0SBwnwt1xqjLxnKfG4XWf7ZdIgbsZ?usp=sharing</w:t>
+        </w:r>
+      </w:hyperlink>
+      <w:r>
+        <w:rPr>
+          <w:rFonts w:ascii="Times New Roman" w:hAnsi="Times New Roman" w:cs="Times New Roman"/>
+        </w:rPr>
+        <w:t xml:space="preserve"> </w:t>
+      </w:r>
     </w:p>
     <w:p>
       <w:pPr>
@@ -371,13 +359,13 @@
         <mc:AlternateContent>
           <mc:Choice Requires="wps">
             <w:drawing>
-              <wp:anchor distT="0" distB="0" distL="114300" distR="114300" simplePos="0" relativeHeight="251674624" behindDoc="0" locked="0" layoutInCell="1" allowOverlap="1" wp14:anchorId="49650EB7" wp14:editId="69D31CE0">
+              <wp:anchor distT="0" distB="0" distL="114300" distR="114300" simplePos="0" relativeHeight="251674624" behindDoc="0" locked="0" layoutInCell="1" allowOverlap="1" wp14:anchorId="49650EB7" wp14:editId="44CCC549">
                 <wp:simplePos x="0" y="0"/>
                 <wp:positionH relativeFrom="column">
-                  <wp:posOffset>4142440</wp:posOffset>
+                  <wp:posOffset>3526088</wp:posOffset>
                 </wp:positionH>
                 <wp:positionV relativeFrom="paragraph">
-                  <wp:posOffset>2519941</wp:posOffset>
+                  <wp:posOffset>2163545</wp:posOffset>
                 </wp:positionV>
                 <wp:extent cx="1953559" cy="226359"/>
                 <wp:effectExtent l="12700" t="12700" r="15240" b="15240"/>
@@ -439,7 +427,7 @@
           </mc:Choice>
           <mc:Fallback>
             <w:pict>
-              <v:rect w14:anchorId="069D7978" id="Rectangle 3" o:spid="_x0000_s1026" style="position:absolute;margin-left:326.2pt;margin-top:198.4pt;width:153.8pt;height:17.8pt;z-index:251674624;visibility:visible;mso-wrap-style:square;mso-width-percent:0;mso-height-percent:0;mso-wrap-distance-left:9pt;mso-wrap-distance-top:0;mso-wrap-distance-right:9pt;mso-wrap-distance-bottom:0;mso-position-horizontal:absolute;mso-position-horizontal-relative:text;mso-position-vertical:absolute;mso-position-vertical-relative:text;mso-width-percent:0;mso-height-percent:0;mso-width-relative:margin;mso-height-relative:margin;v-text-anchor:middle" o:gfxdata="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" filled="f" strokecolor="red" strokeweight="1.5pt"/>
+              <v:rect w14:anchorId="4A3F018A" id="Rectangle 3" o:spid="_x0000_s1026" style="position:absolute;margin-left:277.65pt;margin-top:170.35pt;width:153.8pt;height:17.8pt;z-index:251674624;visibility:visible;mso-wrap-style:square;mso-width-percent:0;mso-height-percent:0;mso-wrap-distance-left:9pt;mso-wrap-distance-top:0;mso-wrap-distance-right:9pt;mso-wrap-distance-bottom:0;mso-position-horizontal:absolute;mso-position-horizontal-relative:text;mso-position-vertical:absolute;mso-position-vertical-relative:text;mso-width-percent:0;mso-height-percent:0;mso-width-relative:margin;mso-height-relative:margin;v-text-anchor:middle" o:gfxdata="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" filled="f" strokecolor="red" strokeweight="1.5pt"/>
             </w:pict>
           </mc:Fallback>
         </mc:AlternateContent>
@@ -450,9 +438,9 @@
           <w:noProof/>
         </w:rPr>
         <w:drawing>
-          <wp:inline distT="0" distB="0" distL="0" distR="0" wp14:anchorId="1E55951D" wp14:editId="290673CC">
-            <wp:extent cx="5943600" cy="3436620"/>
-            <wp:effectExtent l="0" t="0" r="0" b="5080"/>
+          <wp:inline distT="0" distB="0" distL="0" distR="0" wp14:anchorId="1E55951D" wp14:editId="6555EEAE">
+            <wp:extent cx="5178391" cy="2994172"/>
+            <wp:effectExtent l="0" t="0" r="3810" b="3175"/>
             <wp:docPr id="1954152486" name="Picture 9" descr="A screenshot of a computer&#10;&#10;AI-generated content may be incorrect."/>
             <wp:cNvGraphicFramePr>
               <a:graphicFrameLocks xmlns:a="http://schemas.openxmlformats.org/drawingml/2006/main" noChangeAspect="1"/>
@@ -465,7 +453,7 @@
                     <pic:cNvPicPr/>
                   </pic:nvPicPr>
                   <pic:blipFill>
-                    <a:blip r:embed="rId7" cstate="print">
+                    <a:blip r:embed="rId9" cstate="print">
                       <a:extLst>
                         <a:ext uri="{28A0092B-C50C-407E-A947-70E740481C1C}">
                           <a14:useLocalDpi xmlns:a14="http://schemas.microsoft.com/office/drawing/2010/main" val="0"/>
@@ -479,7 +467,7 @@
                   <pic:spPr>
                     <a:xfrm>
                       <a:off x="0" y="0"/>
-                      <a:ext cx="5943600" cy="3436620"/>
+                      <a:ext cx="5185440" cy="2998248"/>
                     </a:xfrm>
                     <a:prstGeom prst="rect">
                       <a:avLst/>
@@ -529,7 +517,7 @@
         </w:rPr>
         <w:br/>
       </w:r>
-      <w:hyperlink r:id="rId8" w:tgtFrame="_new" w:history="1">
+      <w:hyperlink r:id="rId10" w:tgtFrame="_new" w:history="1">
         <w:r>
           <w:rPr>
             <w:rStyle w:val="Hyperlink"/>
@@ -1075,7 +1063,7 @@
                     <pic:cNvPicPr/>
                   </pic:nvPicPr>
                   <pic:blipFill>
-                    <a:blip r:embed="rId9" cstate="print">
+                    <a:blip r:embed="rId11" cstate="print">
                       <a:extLst>
                         <a:ext uri="{28A0092B-C50C-407E-A947-70E740481C1C}">
                           <a14:useLocalDpi xmlns:a14="http://schemas.microsoft.com/office/drawing/2010/main" val="0"/>
@@ -1189,7 +1177,7 @@
                     <pic:cNvPicPr/>
                   </pic:nvPicPr>
                   <pic:blipFill>
-                    <a:blip r:embed="rId10" cstate="print">
+                    <a:blip r:embed="rId12" cstate="print">
                       <a:extLst>
                         <a:ext uri="{28A0092B-C50C-407E-A947-70E740481C1C}">
                           <a14:useLocalDpi xmlns:a14="http://schemas.microsoft.com/office/drawing/2010/main" val="0"/>
@@ -1393,7 +1381,7 @@
                     <pic:cNvPicPr/>
                   </pic:nvPicPr>
                   <pic:blipFill>
-                    <a:blip r:embed="rId11" cstate="print">
+                    <a:blip r:embed="rId13" cstate="print">
                       <a:extLst>
                         <a:ext uri="{28A0092B-C50C-407E-A947-70E740481C1C}">
                           <a14:useLocalDpi xmlns:a14="http://schemas.microsoft.com/office/drawing/2010/main" val="0"/>
@@ -1662,7 +1650,7 @@
                     <pic:cNvPicPr/>
                   </pic:nvPicPr>
                   <pic:blipFill>
-                    <a:blip r:embed="rId12" cstate="print">
+                    <a:blip r:embed="rId14" cstate="print">
                       <a:extLst>
                         <a:ext uri="{28A0092B-C50C-407E-A947-70E740481C1C}">
                           <a14:useLocalDpi xmlns:a14="http://schemas.microsoft.com/office/drawing/2010/main" val="0"/>

</xml_diff>